<commit_message>
fix(e012/R03): bloque de firmas competente art.40.2 (RInfo+RServ aprueban, RSeg conforme)
Sustituye los firmantes incorrectos del acta E-012 (Presidente del Comite + RSeg +
Responsable del Sistema) por las autoridades COMPETENTES de la categorizacion segun
art.40.2 + art.11 RD 311/2022: Responsable de la Informacion y Responsable del
Servicio APRUEBAN (dimensiones de informacion y de servicios respectivamente); el
Responsable de la Seguridad firma CONFORME (sin caracter aprobatorio). El acta solo
se considera aprobada cuando constan AMBAS firmas competentes (RInfo + RServ).

Backend de doble firma (flujo m05 dos-intents + canonicalizacion del path de
generacion m01) en commit siguiente. 20 governance-render PASS.

Co-Authored-By: Claude Opus 4.8 (1M context) <noreply@anthropic.com>
</commit_message>
<xml_diff>
--- a/var/templates_docx/E-012.docx
+++ b/var/templates_docx/E-012.docx
@@ -905,6 +905,101 @@
         <w:t xml:space="preserve">Firmado en {{ cliente.poblacion if cliente.poblacion else '[POBLACIÓN]' }}, a {{ fecha }}.</w:t>
       </w:r>
     </w:p>
+    <w:p>
+      <w:pPr>
+        <w:pStyle w:val="BodyText"/>
+      </w:pPr>
+      <w:r>
+        <w:t xml:space="preserve">Conforme al</w:t>
+      </w:r>
+      <w:r>
+        <w:t xml:space="preserve"> </w:t>
+      </w:r>
+      <w:r>
+        <w:rPr>
+          <w:bCs/>
+          <w:b/>
+        </w:rPr>
+        <w:t xml:space="preserve">artículo 40.2 del RD 311/2022</w:t>
+      </w:r>
+      <w:r>
+        <w:t xml:space="preserve">, la categorización del sistema se aprueba mediante la</w:t>
+      </w:r>
+      <w:r>
+        <w:t xml:space="preserve"> </w:t>
+      </w:r>
+      <w:r>
+        <w:rPr>
+          <w:bCs/>
+          <w:b/>
+        </w:rPr>
+        <w:t xml:space="preserve">doble firma competente</w:t>
+      </w:r>
+      <w:r>
+        <w:t xml:space="preserve">: el</w:t>
+      </w:r>
+      <w:r>
+        <w:t xml:space="preserve"> </w:t>
+      </w:r>
+      <w:r>
+        <w:rPr>
+          <w:bCs/>
+          <w:b/>
+        </w:rPr>
+        <w:t xml:space="preserve">Responsable de la Información</w:t>
+      </w:r>
+      <w:r>
+        <w:t xml:space="preserve"> </w:t>
+      </w:r>
+      <w:r>
+        <w:t xml:space="preserve">determina y aprueba los niveles de las dimensiones que afectan a la información, y el</w:t>
+      </w:r>
+      <w:r>
+        <w:t xml:space="preserve"> </w:t>
+      </w:r>
+      <w:r>
+        <w:rPr>
+          <w:bCs/>
+          <w:b/>
+        </w:rPr>
+        <w:t xml:space="preserve">Responsable del Servicio</w:t>
+      </w:r>
+      <w:r>
+        <w:t xml:space="preserve"> </w:t>
+      </w:r>
+      <w:r>
+        <w:t xml:space="preserve">los de las dimensiones que afectan a los servicios. El</w:t>
+      </w:r>
+      <w:r>
+        <w:t xml:space="preserve"> </w:t>
+      </w:r>
+      <w:r>
+        <w:rPr>
+          <w:bCs/>
+          <w:b/>
+        </w:rPr>
+        <w:t xml:space="preserve">Responsable de la Seguridad</w:t>
+      </w:r>
+      <w:r>
+        <w:t xml:space="preserve"> </w:t>
+      </w:r>
+      <w:r>
+        <w:t xml:space="preserve">suscribe su conformidad sin carácter aprobatorio. El acta solo se considera</w:t>
+      </w:r>
+      <w:r>
+        <w:t xml:space="preserve"> </w:t>
+      </w:r>
+      <w:r>
+        <w:rPr>
+          <w:bCs/>
+          <w:b/>
+        </w:rPr>
+        <w:t xml:space="preserve">aprobada cuando constan las firmas del Responsable de la Información y del Responsable del Servicio</w:t>
+      </w:r>
+      <w:r>
+        <w:t xml:space="preserve">.</w:t>
+      </w:r>
+    </w:p>
     <w:tbl>
       <w:tblPr>
         <w:tblStyle w:val="Table"/>
@@ -913,9 +1008,10 @@
         <w:jc w:val="start"/>
       </w:tblPr>
       <w:tblGrid>
-        <w:gridCol w:w="2640"/>
-        <w:gridCol w:w="2640"/>
-        <w:gridCol w:w="2640"/>
+        <w:gridCol w:w="1980"/>
+        <w:gridCol w:w="1980"/>
+        <w:gridCol w:w="1980"/>
+        <w:gridCol w:w="1980"/>
       </w:tblGrid>
       <w:tr>
         <w:trPr>
@@ -929,7 +1025,7 @@
               <w:jc w:val="left"/>
             </w:pPr>
             <w:r>
-              <w:t xml:space="preserve">Cargo</w:t>
+              <w:t xml:space="preserve">Rol ENS (art. 11)</w:t>
             </w:r>
           </w:p>
         </w:tc>
@@ -942,6 +1038,18 @@
             </w:pPr>
             <w:r>
               <w:t xml:space="preserve">Nombre</w:t>
+            </w:r>
+          </w:p>
+        </w:tc>
+        <w:tc>
+          <w:tcPr/>
+          <w:p>
+            <w:pPr>
+              <w:pStyle w:val="Compact"/>
+              <w:jc w:val="left"/>
+            </w:pPr>
+            <w:r>
+              <w:t xml:space="preserve">Carácter de la firma</w:t>
             </w:r>
           </w:p>
         </w:tc>
@@ -967,19 +1075,41 @@
               <w:jc w:val="left"/>
             </w:pPr>
             <w:r>
-              <w:t xml:space="preserve">Presidente del Comité</w:t>
-            </w:r>
-          </w:p>
-        </w:tc>
-        <w:tc>
-          <w:tcPr/>
-          <w:p>
-            <w:pPr>
-              <w:pStyle w:val="Compact"/>
-              <w:jc w:val="left"/>
-            </w:pPr>
-            <w:r>
-              <w:t xml:space="preserve">{{ comite_seguridad.presidente.nombre if comite_seguridad and comite_seguridad.presidente else '[Presidente]' }}</w:t>
+              <w:t xml:space="preserve">Responsable de la Información</w:t>
+            </w:r>
+          </w:p>
+        </w:tc>
+        <w:tc>
+          <w:tcPr/>
+          <w:p>
+            <w:pPr>
+              <w:pStyle w:val="Compact"/>
+              <w:jc w:val="left"/>
+            </w:pPr>
+            <w:r>
+              <w:t xml:space="preserve">{{ responsables.responsable_informacion.nombre if responsables.responsable_informacion else '[A DESIGNAR]' }}</w:t>
+            </w:r>
+          </w:p>
+        </w:tc>
+        <w:tc>
+          <w:tcPr/>
+          <w:p>
+            <w:pPr>
+              <w:pStyle w:val="Compact"/>
+              <w:jc w:val="left"/>
+            </w:pPr>
+            <w:r>
+              <w:rPr>
+                <w:bCs/>
+                <w:b/>
+              </w:rPr>
+              <w:t xml:space="preserve">Aprueba</w:t>
+            </w:r>
+            <w:r>
+              <w:t xml:space="preserve"> </w:t>
+            </w:r>
+            <w:r>
+              <w:t xml:space="preserve">(dimensiones de la información)</w:t>
             </w:r>
           </w:p>
         </w:tc>
@@ -1005,19 +1135,41 @@
               <w:jc w:val="left"/>
             </w:pPr>
             <w:r>
-              <w:t xml:space="preserve">Responsable de la Seguridad</w:t>
-            </w:r>
-          </w:p>
-        </w:tc>
-        <w:tc>
-          <w:tcPr/>
-          <w:p>
-            <w:pPr>
-              <w:pStyle w:val="Compact"/>
-              <w:jc w:val="left"/>
-            </w:pPr>
-            <w:r>
-              <w:t xml:space="preserve">{{ responsables.responsable_seguridad.nombre if responsables.responsable_seguridad else '[RS]' }}</w:t>
+              <w:t xml:space="preserve">Responsable del Servicio</w:t>
+            </w:r>
+          </w:p>
+        </w:tc>
+        <w:tc>
+          <w:tcPr/>
+          <w:p>
+            <w:pPr>
+              <w:pStyle w:val="Compact"/>
+              <w:jc w:val="left"/>
+            </w:pPr>
+            <w:r>
+              <w:t xml:space="preserve">{{ responsables.responsable_servicio.nombre if responsables.responsable_servicio else '[A DESIGNAR]' }}</w:t>
+            </w:r>
+          </w:p>
+        </w:tc>
+        <w:tc>
+          <w:tcPr/>
+          <w:p>
+            <w:pPr>
+              <w:pStyle w:val="Compact"/>
+              <w:jc w:val="left"/>
+            </w:pPr>
+            <w:r>
+              <w:rPr>
+                <w:bCs/>
+                <w:b/>
+              </w:rPr>
+              <w:t xml:space="preserve">Aprueba</w:t>
+            </w:r>
+            <w:r>
+              <w:t xml:space="preserve"> </w:t>
+            </w:r>
+            <w:r>
+              <w:t xml:space="preserve">(dimensiones de los servicios)</w:t>
             </w:r>
           </w:p>
         </w:tc>
@@ -1043,19 +1195,31 @@
               <w:jc w:val="left"/>
             </w:pPr>
             <w:r>
-              <w:t xml:space="preserve">Responsable del Sistema</w:t>
-            </w:r>
-          </w:p>
-        </w:tc>
-        <w:tc>
-          <w:tcPr/>
-          <w:p>
-            <w:pPr>
-              <w:pStyle w:val="Compact"/>
-              <w:jc w:val="left"/>
-            </w:pPr>
-            <w:r>
-              <w:t xml:space="preserve">{{ responsables.responsable_sistema.nombre if responsables.responsable_sistema else '[RSI]' }}</w:t>
+              <w:t xml:space="preserve">Responsable de la Seguridad</w:t>
+            </w:r>
+          </w:p>
+        </w:tc>
+        <w:tc>
+          <w:tcPr/>
+          <w:p>
+            <w:pPr>
+              <w:pStyle w:val="Compact"/>
+              <w:jc w:val="left"/>
+            </w:pPr>
+            <w:r>
+              <w:t xml:space="preserve">{{ responsables.responsable_seguridad.nombre if responsables.responsable_seguridad else '[A DESIGNAR]' }}</w:t>
+            </w:r>
+          </w:p>
+        </w:tc>
+        <w:tc>
+          <w:tcPr/>
+          <w:p>
+            <w:pPr>
+              <w:pStyle w:val="Compact"/>
+              <w:jc w:val="left"/>
+            </w:pPr>
+            <w:r>
+              <w:t xml:space="preserve">Conforme (no aprobador)</w:t>
             </w:r>
           </w:p>
         </w:tc>

</xml_diff>